<commit_message>
Versionner la charte, les deux ensembles d’icônes, les incrustations experts et la couche vidéaste.
Les overlays reprennent d’abord les pictos du cycle (schéma 5), puis un ensemble 2 pour la PI et l’écosystème, avec les couleurs de phase.

Co-authored-by: Cursor <cursoragent@cursor.com>
</commit_message>
<xml_diff>
--- a/downloads/intro-transcript-outro/01_T1.docx
+++ b/downloads/intro-transcript-outro/01_T1.docx
@@ -34,7 +34,23 @@
         <w:rPr>
           <w:color w:val="2EAF7D"/>
         </w:rPr>
-        <w:t xml:space="preserve">Vous allez entendre plusieurs chercheur·ses raconter comment une innovation a commencé, chez eux. Ce n’est pas un mode d’emploi : ce sont des chemins différents.</w:t>
+        <w:t xml:space="preserve">On ne commence pas par un cours. On commence par des voix.</w:t>
+      </w:r>
+    </w:p>
+    <w:p>
+      <w:r>
+        <w:rPr>
+          <w:color w:val="2EAF7D"/>
+        </w:rPr>
+        <w:t xml:space="preserve">Sylvia, Loïc, Muriel, Yann, Jean-Jacques : des chercheuses et des chercheurs de Paris-Saclay qui ont osé.</w:t>
+      </w:r>
+    </w:p>
+    <w:p>
+      <w:r>
+        <w:rPr>
+          <w:color w:val="2EAF7D"/>
+        </w:rPr>
+        <w:t xml:space="preserve">Écoutez comment, chez eux, une innovation a pris naissance. Les chemins ne sont pas les mêmes. C’est précisément ce que nous allons apprendre à reconnaître.</w:t>
       </w:r>
     </w:p>
     <w:p>
@@ -341,7 +357,23 @@
         <w:rPr>
           <w:color w:val="F48C2E"/>
         </w:rPr>
-        <w:t xml:space="preserve">Une innovation peut naître de plusieurs origines. Bernard va maintenant poser les mots : tech-push, market-pull, usage, rencontre, sérendipité.</w:t>
+        <w:t xml:space="preserve">Vous venez d’entendre plusieurs origines, encore sans les nommer : un pas de côté, un besoin, une rencontre, des années de recherche.</w:t>
+      </w:r>
+    </w:p>
+    <w:p>
+      <w:r>
+        <w:rPr>
+          <w:color w:val="F48C2E"/>
+        </w:rPr>
+        <w:t xml:space="preserve">Bernard, juste après, va poser les mots — tech-push, market-pull, usage, rencontre, sérendipité.</w:t>
+      </w:r>
+    </w:p>
+    <w:p>
+      <w:r>
+        <w:rPr>
+          <w:color w:val="F48C2E"/>
+        </w:rPr>
+        <w:t xml:space="preserve">Gardez vos propres travaux en tête pendant que vous l’écoutez.</w:t>
       </w:r>
     </w:p>
     <w:sectPr>

</xml_diff>

<commit_message>
Aligner les capsules expert sur le numéro de cadre à partir de V14.
E13bis devient E14 (Yoann) et les suivantes avancent d’un cran, jusqu’à E25. L’interface reprend aussi les couleurs de la charte.

Co-authored-by: Cursor <cursoragent@cursor.com>
</commit_message>
<xml_diff>
--- a/downloads/intro-transcript-outro/01_T1.docx
+++ b/downloads/intro-transcript-outro/01_T1.docx
@@ -24,7 +24,7 @@
       </w:pPr>
       <w:r>
         <w:rPr>
-          <w:color w:val="2EAF7D"/>
+          <w:color w:val="00AE69"/>
         </w:rPr>
         <w:t xml:space="preserve">Intro</w:t>
       </w:r>
@@ -32,7 +32,7 @@
     <w:p>
       <w:r>
         <w:rPr>
-          <w:color w:val="2EAF7D"/>
+          <w:color w:val="00AE69"/>
         </w:rPr>
         <w:t xml:space="preserve">On ne commence pas par un cours. On commence par des voix.</w:t>
       </w:r>
@@ -40,7 +40,7 @@
     <w:p>
       <w:r>
         <w:rPr>
-          <w:color w:val="2EAF7D"/>
+          <w:color w:val="00AE69"/>
         </w:rPr>
         <w:t xml:space="preserve">Sylvia, Loïc, Muriel, Yann, Jean-Jacques : des chercheuses et des chercheurs de Paris-Saclay qui ont osé.</w:t>
       </w:r>
@@ -48,7 +48,7 @@
     <w:p>
       <w:r>
         <w:rPr>
-          <w:color w:val="2EAF7D"/>
+          <w:color w:val="00AE69"/>
         </w:rPr>
         <w:t xml:space="preserve">Écoutez comment, chez eux, une innovation a pris naissance. Les chemins ne sont pas les mêmes. C’est précisément ce que nous allons apprendre à reconnaître.</w:t>
       </w:r>
@@ -347,7 +347,7 @@
       </w:pPr>
       <w:r>
         <w:rPr>
-          <w:color w:val="F48C2E"/>
+          <w:color w:val="F0821A"/>
         </w:rPr>
         <w:t xml:space="preserve">Outro</w:t>
       </w:r>
@@ -355,7 +355,7 @@
     <w:p>
       <w:r>
         <w:rPr>
-          <w:color w:val="F48C2E"/>
+          <w:color w:val="F0821A"/>
         </w:rPr>
         <w:t xml:space="preserve">Vous venez d’entendre plusieurs origines, encore sans les nommer : un pas de côté, un besoin, une rencontre, des années de recherche.</w:t>
       </w:r>
@@ -363,7 +363,7 @@
     <w:p>
       <w:r>
         <w:rPr>
-          <w:color w:val="F48C2E"/>
+          <w:color w:val="F0821A"/>
         </w:rPr>
         <w:t xml:space="preserve">Bernard, juste après, va poser les mots — tech-push, market-pull, usage, rencontre, sérendipité.</w:t>
       </w:r>
@@ -371,7 +371,7 @@
     <w:p>
       <w:r>
         <w:rPr>
-          <w:color w:val="F48C2E"/>
+          <w:color w:val="F0821A"/>
         </w:rPr>
         <w:t xml:space="preserve">Gardez vos propres travaux en tête pendant que vous l’écoutez.</w:t>
       </w:r>
@@ -406,7 +406,7 @@
       <w:b/>
       <w:sz w:val="36"/>
       <w:szCs w:val="36"/>
-      <w:color w:val="580F45"/>
+      <w:color w:val="63003C"/>
     </w:rPr>
   </w:style>
   <w:style w:type="paragraph" w:styleId="Heading2">
@@ -422,7 +422,7 @@
       <w:b/>
       <w:sz w:val="26"/>
       <w:szCs w:val="26"/>
-      <w:color w:val="F48C2E"/>
+      <w:color w:val="F0821A"/>
     </w:rPr>
   </w:style>
 </w:styles>

</xml_diff>